<commit_message>
Pergola quote: use only the original text, no clauses from other quotes
Restore original wording (masculine forms, 'local authority', hourly rate
tied to the permit digitization clause), original section names and the
original signature block. Signature labels and centered lines are now
configurable in quote-core.

Co-Authored-By: Claude Opus 5.5 <noreply@anthropic.com>
Claude-Session: https://claude.ai/code/session_016Hp24NBLyaPEZ9cbCk6n6f
</commit_message>
<xml_diff>
--- a/הצעות מחיר/הצעת מחיר - היתר פרגולה - דרך מגדיאל 48 הוד השרון.docx
+++ b/הצעות מחיר/הצעת מחיר - היתר פרגולה - דרך מגדיאל 48 הוד השרון.docx
@@ -2,73 +2,6 @@
 <file path=word/document.xml><?xml version="1.0" encoding="utf-8"?>
 <w:document xmlns:wpc="http://schemas.microsoft.com/office/word/2010/wordprocessingCanvas" xmlns:mc="http://schemas.openxmlformats.org/markup-compatibility/2006" xmlns:o="urn:schemas-microsoft-com:office:office" xmlns:r="http://schemas.openxmlformats.org/officeDocument/2006/relationships" xmlns:m="http://schemas.openxmlformats.org/officeDocument/2006/math" xmlns:v="urn:schemas-microsoft-com:vml" xmlns:wp14="http://schemas.microsoft.com/office/word/2010/wordprocessingDrawing" xmlns:wp="http://schemas.openxmlformats.org/drawingml/2006/wordprocessingDrawing" xmlns:w10="urn:schemas-microsoft-com:office:word" xmlns:w="http://schemas.openxmlformats.org/wordprocessingml/2006/main" xmlns:w14="http://schemas.microsoft.com/office/word/2010/wordml" xmlns:w15="http://schemas.microsoft.com/office/word/2012/wordml" xmlns:wpg="http://schemas.microsoft.com/office/word/2010/wordprocessingGroup" xmlns:wpi="http://schemas.microsoft.com/office/word/2010/wordprocessingInk" xmlns:wne="http://schemas.microsoft.com/office/word/2006/wordml" xmlns:wps="http://schemas.microsoft.com/office/word/2010/wordprocessingShape" xmlns:cx="http://schemas.microsoft.com/office/drawing/2014/chartex" xmlns:cx1="http://schemas.microsoft.com/office/drawing/2015/9/8/chartex" xmlns:cx2="http://schemas.microsoft.com/office/drawing/2015/10/21/chartex" xmlns:cx3="http://schemas.microsoft.com/office/drawing/2016/5/9/chartex" xmlns:cx4="http://schemas.microsoft.com/office/drawing/2016/5/10/chartex" xmlns:cx5="http://schemas.microsoft.com/office/drawing/2016/5/11/chartex" xmlns:cx6="http://schemas.microsoft.com/office/drawing/2016/5/12/chartex" xmlns:cx7="http://schemas.microsoft.com/office/drawing/2016/5/13/chartex" xmlns:cx8="http://schemas.microsoft.com/office/drawing/2016/5/14/chartex" xmlns:aink="http://schemas.microsoft.com/office/drawing/2016/ink" xmlns:am3d="http://schemas.microsoft.com/office/drawing/2017/model3d" xmlns:w16cex="http://schemas.microsoft.com/office/word/2018/wordml/cex" xmlns:w16cid="http://schemas.microsoft.com/office/word/2016/wordml/cid" xmlns:w16="http://schemas.microsoft.com/office/word/2018/wordml" xmlns:w16sdtdh="http://schemas.microsoft.com/office/word/2020/wordml/sdtdatahash" xmlns:w16se="http://schemas.microsoft.com/office/word/2015/wordml/symex" mc:Ignorable="w14 w15 wp14">
   <w:body>
-    <w:p>
-      <w:pPr>
-        <w:bidi/>
-        <w:spacing w:after="40"/>
-      </w:pPr>
-      <w:r>
-        <w:rPr>
-          <w:rFonts w:ascii="Arial" w:cs="Arial" w:eastAsia="Arial" w:hAnsi="Arial"/>
-          <w:sz w:val="22"/>
-          <w:szCs w:val="22"/>
-          <w:rtl/>
-        </w:rPr>
-        <w:t xml:space="preserve">תאריך: </w:t>
-      </w:r>
-      <w:r>
-        <w:rPr>
-          <w:rFonts w:ascii="Arial" w:cs="Arial" w:eastAsia="Arial" w:hAnsi="Arial"/>
-          <w:sz w:val="22"/>
-          <w:szCs w:val="22"/>
-          <w:highlight w:val="yellow"/>
-          <w:highlightCs w:val="yellow"/>
-          <w:rtl/>
-        </w:rPr>
-        <w:t xml:space="preserve">__/__/__</w:t>
-      </w:r>
-    </w:p>
-    <w:p>
-      <w:pPr>
-        <w:bidi/>
-        <w:spacing w:after="40"/>
-      </w:pPr>
-      <w:r>
-        <w:rPr>
-          <w:rFonts w:ascii="Arial" w:cs="Arial" w:eastAsia="Arial" w:hAnsi="Arial"/>
-          <w:sz w:val="22"/>
-          <w:szCs w:val="22"/>
-          <w:rtl/>
-        </w:rPr>
-        <w:t xml:space="preserve">לכבוד: </w:t>
-      </w:r>
-      <w:r>
-        <w:rPr>
-          <w:rFonts w:ascii="Arial" w:cs="Arial" w:eastAsia="Arial" w:hAnsi="Arial"/>
-          <w:sz w:val="22"/>
-          <w:szCs w:val="22"/>
-          <w:highlight w:val="yellow"/>
-          <w:highlightCs w:val="yellow"/>
-          <w:rtl/>
-        </w:rPr>
-        <w:t xml:space="preserve">שם המזמין/ים</w:t>
-      </w:r>
-    </w:p>
-    <w:p>
-      <w:pPr>
-        <w:bidi/>
-        <w:spacing w:after="300"/>
-      </w:pPr>
-      <w:r>
-        <w:rPr>
-          <w:rFonts w:ascii="Arial" w:cs="Arial" w:eastAsia="Arial" w:hAnsi="Arial"/>
-          <w:sz w:val="22"/>
-          <w:szCs w:val="22"/>
-          <w:rtl/>
-        </w:rPr>
-        <w:t xml:space="preserve">כתובת הנכס: דרך מגדיאל 48, הוד השרון</w:t>
-      </w:r>
-    </w:p>
     <w:p>
       <w:pPr>
         <w:bidi/>
@@ -91,6 +24,22 @@
     <w:p>
       <w:pPr>
         <w:bidi/>
+        <w:spacing w:after="300"/>
+        <w:jc w:val="center"/>
+      </w:pPr>
+      <w:r>
+        <w:rPr>
+          <w:rFonts w:ascii="Arial" w:cs="Arial" w:eastAsia="Arial" w:hAnsi="Arial"/>
+          <w:sz w:val="22"/>
+          <w:szCs w:val="22"/>
+          <w:rtl/>
+        </w:rPr>
+        <w:t xml:space="preserve">רחוב דרך מגדיאל 48, הוד השרון</w:t>
+      </w:r>
+    </w:p>
+    <w:p>
+      <w:pPr>
+        <w:bidi/>
         <w:spacing w:after="100" w:line="300"/>
       </w:pPr>
       <w:r>
@@ -137,7 +86,7 @@
           <w:szCs w:val="26"/>
           <w:rtl/>
         </w:rPr>
-        <w:t xml:space="preserve">1. הגדרת השירות</w:t>
+        <w:t xml:space="preserve">1. הגדרת השירות (מהות הפרויקט)</w:t>
       </w:r>
     </w:p>
     <w:p>
@@ -152,7 +101,7 @@
           <w:szCs w:val="22"/>
           <w:rtl/>
         </w:rPr>
-        <w:t xml:space="preserve">שירות אדריכלי להכנת בקשה להיתר בנייה לתוספת פרגולה בשטח של כ-28 מ"ר במרפסת הדירה.</w:t>
+        <w:t xml:space="preserve">שירות אדריכלי להכנת בקשה להיתר לתוספת פרגולה של כ-28 מ"ר במרפסת הדירה.</w:t>
       </w:r>
     </w:p>
     <w:p>
@@ -189,7 +138,7 @@
           <w:szCs w:val="22"/>
           <w:rtl/>
         </w:rPr>
-        <w:t xml:space="preserve">האדריכלית תטפל בכל שלבי ההכנה וההגשה של הבקשה להיתר בנייה למִנהל ההנדסה של עיריית הוד השרון, לרבות:</w:t>
+        <w:t xml:space="preserve">האדריכל יטפל בכל שלבי הכנת והגשת בקשה לרישיון בנייה (היתר בנייה) למִנהל ההנדסה של עיריית הוד השרון, לרבות:</w:t>
       </w:r>
     </w:p>
     <w:p>
@@ -209,7 +158,7 @@
           <w:szCs w:val="22"/>
           <w:rtl/>
         </w:rPr>
-        <w:t xml:space="preserve">הכנה וטיפול בבקשת תיק מידע תכנוני מהוועדה המקומית לתכנון ובנייה, כולל:</w:t>
+        <w:t xml:space="preserve">הכנה וטיפול בבקשת תיק מידע תכנוני מהרשות המקומית לתכנון ובנייה, כולל:</w:t>
       </w:r>
     </w:p>
     <w:p>
@@ -229,7 +178,7 @@
           <w:szCs w:val="22"/>
           <w:rtl/>
         </w:rPr>
-        <w:t xml:space="preserve">תיאום מול הרשויות והגשת כלל המסמכים המקצועיים במערכת.</w:t>
+        <w:t xml:space="preserve">תיאום מול רשויות והגשת כלל המסמכים המקצועיים במערכת.</w:t>
       </w:r>
     </w:p>
     <w:p>
@@ -249,7 +198,7 @@
           <w:szCs w:val="22"/>
           <w:rtl/>
         </w:rPr>
-        <w:t xml:space="preserve">תיאום עם הגורמים המקצועיים הנדרשים לקבלת תיק המידע.</w:t>
+        <w:t xml:space="preserve">תיאום עם הגורמים המקצועיים הנדרשים לטובת קבלת תיק המידע.</w:t>
       </w:r>
     </w:p>
     <w:p>
@@ -269,7 +218,7 @@
           <w:szCs w:val="22"/>
           <w:rtl/>
         </w:rPr>
-        <w:t xml:space="preserve">הגשת הבקשה במערכת "רישוי זמין".</w:t>
+        <w:t xml:space="preserve">הגשה של הבקשה במערכת הרישוי הזמין.</w:t>
       </w:r>
     </w:p>
     <w:p>
@@ -289,7 +238,7 @@
           <w:szCs w:val="22"/>
           <w:rtl/>
         </w:rPr>
-        <w:t xml:space="preserve">טיפול בתגובות, הערות ועדכונים מרשות התכנון, עד לקבלת היתר רשמי.</w:t>
+        <w:t xml:space="preserve">טיפול בתגובות / הערות ועדכונים מרשות התכנון, עד קבלת היתר רשמי.</w:t>
       </w:r>
     </w:p>
     <w:p>
@@ -327,7 +276,7 @@
           <w:szCs w:val="22"/>
           <w:rtl/>
         </w:rPr>
-        <w:t xml:space="preserve">לוחות הזמנים בפועל תלויים במחזורי הטיפול של הוועדה המקומית, כפי שיוגדרו לאחר קבלת המידע, ובהתאם לדרישות בודקי הבקשה לאורך התהליך במערכת רישוי זמין.</w:t>
+        <w:t xml:space="preserve">לוחות זמנים בפועל תלויים במחזורי הטיפול של הוועדה המקומית, כפי שיוגדרו לאחר קבלת המידע ובהתאם לדרישות בודקי הבקשה לאורך התהליך במערכת רישוי זמין.</w:t>
       </w:r>
     </w:p>
     <w:p>
@@ -347,7 +296,7 @@
           <w:szCs w:val="22"/>
           <w:rtl/>
         </w:rPr>
-        <w:t xml:space="preserve">מסמכים או אישורים הנוגעים למבנה הקיים (כגון מדידה, חתימות, נסח טאבו וכו') יסופקו ע"י המזמין.</w:t>
+        <w:t xml:space="preserve">במידה ויידרשו מסמכים / אישורים הנוגעים למבנה הקיים (כגון מדידה, חתימות, נסח טאבו וכו') – הם יסופקו ע"י המזמין.</w:t>
       </w:r>
     </w:p>
     <w:p>
@@ -367,7 +316,27 @@
           <w:szCs w:val="22"/>
           <w:rtl/>
         </w:rPr>
-        <w:t xml:space="preserve">למען הסר ספק, המזמין מצהיר כי ידוע לו שהאדריכלית אינה יכולה להתחייב שהוועדה תאשר את הבקשה, והאדריכלית לא תישא באחריות לתוצאות החלטת הוועדה.</w:t>
+        <w:t xml:space="preserve">למען הסר ספק, המזמין מצהיר בזאת כי ידוע לו שנותן השירות אינו יכול להתחייב כי הוועדה תיתן את אישורה לבקשה המבוקשת.</w:t>
+      </w:r>
+    </w:p>
+    <w:p>
+      <w:pPr>
+        <w:pStyle w:val="ListParagraph"/>
+        <w:numPr>
+          <w:ilvl w:val="0"/>
+          <w:numId w:val="2"/>
+        </w:numPr>
+        <w:bidi/>
+        <w:spacing w:after="60" w:line="290"/>
+      </w:pPr>
+      <w:r>
+        <w:rPr>
+          <w:rFonts w:ascii="Arial" w:cs="Arial" w:eastAsia="Arial" w:hAnsi="Arial"/>
+          <w:sz w:val="22"/>
+          <w:szCs w:val="22"/>
+          <w:rtl/>
+        </w:rPr>
+        <w:t xml:space="preserve">האדריכל לא יישא באחריות לתוצאות אישור הוועדה עצמה.</w:t>
       </w:r>
     </w:p>
     <w:p>
@@ -389,7 +358,223 @@
           <w:szCs w:val="26"/>
           <w:rtl/>
         </w:rPr>
-        <w:t xml:space="preserve">3. ההצעה אינה כוללת</w:t>
+        <w:t xml:space="preserve">3. הגנה משפטית – הסרת אחריות</w:t>
+      </w:r>
+    </w:p>
+    <w:p>
+      <w:pPr>
+        <w:pStyle w:val="ListParagraph"/>
+        <w:numPr>
+          <w:ilvl w:val="0"/>
+          <w:numId w:val="3"/>
+        </w:numPr>
+        <w:bidi/>
+        <w:spacing w:after="80" w:line="290"/>
+      </w:pPr>
+      <w:r>
+        <w:rPr>
+          <w:rFonts w:ascii="Arial" w:cs="Arial" w:eastAsia="Arial" w:hAnsi="Arial"/>
+          <w:sz w:val="22"/>
+          <w:szCs w:val="22"/>
+          <w:rtl/>
+        </w:rPr>
+        <w:t xml:space="preserve">היתר זה אינו כולל בדיקה / תכנון / טיפול בחריגות בנייה קיימות, חיזוק מבנים, שיפוץ מערכות, או כל עבודה אחרת / התאמה של שטחים, ללא הסדרה של חריגות מהקיים בהיתר הקיים בשטחים המשותפים או הפרטיים של הבניין, או שינוי בעיצוב החזיתות עצמן / כל אלמנט אחר בחזיתות המבנה ביחס לקיים בהיתר הבנייה. היה ותימצא חריגה ע"י פיקוח הבנייה במהלך התהליך – לא תהיה למזמין או למי מהדיירים טענה כלשהי, והאחריות תחול על מזמין העבודה בלבד.</w:t>
+      </w:r>
+    </w:p>
+    <w:p>
+      <w:pPr>
+        <w:pStyle w:val="ListParagraph"/>
+        <w:numPr>
+          <w:ilvl w:val="0"/>
+          <w:numId w:val="3"/>
+        </w:numPr>
+        <w:bidi/>
+        <w:spacing w:after="80" w:line="290"/>
+      </w:pPr>
+      <w:r>
+        <w:rPr>
+          <w:rFonts w:ascii="Arial" w:cs="Arial" w:eastAsia="Arial" w:hAnsi="Arial"/>
+          <w:sz w:val="22"/>
+          <w:szCs w:val="22"/>
+          <w:rtl/>
+        </w:rPr>
+        <w:t xml:space="preserve">במידה ותימצא אי-התאמה של חזיתות המבנה להיתר – מוסכם כי האדריכל רשאי להסיר עצמו מתפקיד עורך הבקשה, ולא תהיה כל טענה או אחריות להסדרת חריגות אלה.</w:t>
+      </w:r>
+    </w:p>
+    <w:p>
+      <w:pPr>
+        <w:pStyle w:val="ListParagraph"/>
+        <w:numPr>
+          <w:ilvl w:val="0"/>
+          <w:numId w:val="3"/>
+        </w:numPr>
+        <w:bidi/>
+        <w:spacing w:after="80" w:line="290"/>
+      </w:pPr>
+      <w:r>
+        <w:rPr>
+          <w:rFonts w:ascii="Arial" w:cs="Arial" w:eastAsia="Arial" w:hAnsi="Arial"/>
+          <w:sz w:val="22"/>
+          <w:szCs w:val="22"/>
+          <w:rtl/>
+        </w:rPr>
+        <w:t xml:space="preserve">אם במהלך התהליך יעלו דרישות מהרשות המקומית שאינן קשורות לתוספת הפרגולה (כגון דרישות בטיחות / חדשות / תקנות עירוניות / טיפול בדרישות לפירוק אלמנטים שאינם קיימים בהיתר המקורי וכו'): יוגדר שירות נוסף שיתומחר בנפרד, וכל תוספת תתואם ותאושר בכתב בטרם ביצוע.</w:t>
+      </w:r>
+    </w:p>
+    <w:p>
+      <w:pPr>
+        <w:pStyle w:val="ListParagraph"/>
+        <w:numPr>
+          <w:ilvl w:val="0"/>
+          <w:numId w:val="3"/>
+        </w:numPr>
+        <w:bidi/>
+        <w:spacing w:after="80" w:line="290"/>
+      </w:pPr>
+      <w:r>
+        <w:rPr>
+          <w:rFonts w:ascii="Arial" w:cs="Arial" w:eastAsia="Arial" w:hAnsi="Arial"/>
+          <w:sz w:val="22"/>
+          <w:szCs w:val="22"/>
+          <w:rtl/>
+        </w:rPr>
+        <w:t xml:space="preserve">טיפול בדרישות לפירוק אלמנטים שאינם קיימים בהיתר המקורי וכו' – יטופל ע"י המבקש. לוח הזמנים לטיפול ולביצוע – באחריות המבקש בלבד. פגיעה בלוחות הזמנים בטיפול בבקשה כתוצאה מסעיפים אלה אינה באחריות האדריכל.</w:t>
+      </w:r>
+    </w:p>
+    <w:p>
+      <w:pPr>
+        <w:pStyle w:val="ListParagraph"/>
+        <w:numPr>
+          <w:ilvl w:val="0"/>
+          <w:numId w:val="3"/>
+        </w:numPr>
+        <w:bidi/>
+        <w:spacing w:after="80" w:line="290"/>
+      </w:pPr>
+      <w:r>
+        <w:rPr>
+          <w:rFonts w:ascii="Arial" w:cs="Arial" w:eastAsia="Arial" w:hAnsi="Arial"/>
+          <w:sz w:val="22"/>
+          <w:szCs w:val="22"/>
+          <w:rtl/>
+        </w:rPr>
+        <w:t xml:space="preserve">תבוצע התאמה מלאה של המבנה וכל אלמנט אחר הקיים בשטח לתכנית ההיתר, ללא חריגות / שינויים, על מנת שעורך הבקשה יוכל להצהיר כי קיימת התאמה להיתר הקיים.</w:t>
+      </w:r>
+    </w:p>
+    <w:p>
+      <w:pPr>
+        <w:pStyle w:val="ListParagraph"/>
+        <w:numPr>
+          <w:ilvl w:val="0"/>
+          <w:numId w:val="3"/>
+        </w:numPr>
+        <w:bidi/>
+        <w:spacing w:after="80" w:line="290"/>
+      </w:pPr>
+      <w:r>
+        <w:rPr>
+          <w:rFonts w:ascii="Arial" w:cs="Arial" w:eastAsia="Arial" w:hAnsi="Arial"/>
+          <w:sz w:val="22"/>
+          <w:szCs w:val="22"/>
+          <w:rtl/>
+        </w:rPr>
+        <w:t xml:space="preserve">האחריות אינה כוללת: כשל בביצועים הנחוצים לאחר קבלת ההיתר (כגון ביצועי הבנייה / קבלנים).</w:t>
+      </w:r>
+    </w:p>
+    <w:p>
+      <w:pPr>
+        <w:keepNext/>
+        <w:pBdr>
+          <w:bottom w:val="single" w:color="C9C2BC" w:sz="6" w:space="4"/>
+        </w:pBdr>
+        <w:bidi/>
+        <w:spacing w:after="140" w:before="360"/>
+      </w:pPr>
+      <w:r>
+        <w:rPr>
+          <w:rFonts w:ascii="Arial" w:cs="Arial" w:eastAsia="Arial" w:hAnsi="Arial"/>
+          <w:b/>
+          <w:bCs/>
+          <w:color w:val="6E625A"/>
+          <w:sz w:val="26"/>
+          <w:szCs w:val="26"/>
+          <w:rtl/>
+        </w:rPr>
+        <w:t xml:space="preserve">4. טיפול בהתנגדויות ציבוריות / מחלוקות</w:t>
+      </w:r>
+    </w:p>
+    <w:p>
+      <w:pPr>
+        <w:bidi/>
+        <w:spacing w:after="100" w:line="300"/>
+      </w:pPr>
+      <w:r>
+        <w:rPr>
+          <w:rFonts w:ascii="Arial" w:cs="Arial" w:eastAsia="Arial" w:hAnsi="Arial"/>
+          <w:sz w:val="22"/>
+          <w:szCs w:val="22"/>
+          <w:rtl/>
+        </w:rPr>
+        <w:t xml:space="preserve">תהליך קבלת ההיתר עשוי לכלול תקופה בה יש הזדמנות להתנגדויות מצד שכנים או גורמים ציבוריים. טיפול במצב בו תתגלע התנגדות אינו באחריות האדריכל.</w:t>
+      </w:r>
+    </w:p>
+    <w:p>
+      <w:pPr>
+        <w:keepNext/>
+        <w:pBdr>
+          <w:bottom w:val="single" w:color="C9C2BC" w:sz="6" w:space="4"/>
+        </w:pBdr>
+        <w:bidi/>
+        <w:spacing w:after="140" w:before="360"/>
+      </w:pPr>
+      <w:r>
+        <w:rPr>
+          <w:rFonts w:ascii="Arial" w:cs="Arial" w:eastAsia="Arial" w:hAnsi="Arial"/>
+          <w:b/>
+          <w:bCs/>
+          <w:color w:val="6E625A"/>
+          <w:sz w:val="26"/>
+          <w:szCs w:val="26"/>
+          <w:rtl/>
+        </w:rPr>
+        <w:t xml:space="preserve">5. זכויות קניין רוחני וסודיות</w:t>
+      </w:r>
+    </w:p>
+    <w:p>
+      <w:pPr>
+        <w:bidi/>
+        <w:spacing w:after="100" w:line="300"/>
+      </w:pPr>
+      <w:r>
+        <w:rPr>
+          <w:rFonts w:ascii="Arial" w:cs="Arial" w:eastAsia="Arial" w:hAnsi="Arial"/>
+          <w:sz w:val="22"/>
+          <w:szCs w:val="22"/>
+          <w:rtl/>
+        </w:rPr>
+        <w:t xml:space="preserve">כל התכניות והמסמכים שיופקו על-ידי האדריכל הם רכוש מקצועי עד לתשלום מלא.</w:t>
+      </w:r>
+    </w:p>
+    <w:p>
+      <w:pPr>
+        <w:keepNext/>
+        <w:pBdr>
+          <w:bottom w:val="single" w:color="C9C2BC" w:sz="6" w:space="4"/>
+        </w:pBdr>
+        <w:bidi/>
+        <w:spacing w:after="140" w:before="360"/>
+      </w:pPr>
+      <w:r>
+        <w:rPr>
+          <w:rFonts w:ascii="Arial" w:cs="Arial" w:eastAsia="Arial" w:hAnsi="Arial"/>
+          <w:b/>
+          <w:bCs/>
+          <w:color w:val="6E625A"/>
+          <w:sz w:val="26"/>
+          <w:szCs w:val="26"/>
+          <w:rtl/>
+        </w:rPr>
+        <w:t xml:space="preserve">6. ההצעה לא כוללת</w:t>
       </w:r>
     </w:p>
     <w:p>
@@ -409,7 +594,7 @@
           <w:szCs w:val="22"/>
           <w:rtl/>
         </w:rPr>
-        <w:t xml:space="preserve">תשלום על שירותים ויועצים הנדרשים לקבלת ההיתר, לרבות מהנדס, מודד וכו'.</w:t>
+        <w:t xml:space="preserve">תשלום על שירותים ויועצים הנדרשים לצורך קבלת היתר, לרבות מהנדס, מודד וכו'.</w:t>
       </w:r>
     </w:p>
     <w:p>
@@ -429,7 +614,7 @@
           <w:szCs w:val="22"/>
           <w:rtl/>
         </w:rPr>
-        <w:t xml:space="preserve">הפקת נסח טאבו, תשלום אגרות, היטלים, מיסים וכו', וכן הדפסות ושליחתן.</w:t>
+        <w:t xml:space="preserve">עלות הפקת נסח טאבו / תשלום אגרות / היטלים / מיסים וכו' / הדפסות ושליחתן.</w:t>
       </w:r>
     </w:p>
     <w:p>
@@ -449,7 +634,7 @@
           <w:szCs w:val="22"/>
           <w:rtl/>
         </w:rPr>
-        <w:t xml:space="preserve">פיקוח על ביצוע הבנייה או על טיבה, וכל הקשור לביצוע: לוחות זמנים, ביטוחים, תמחור וכו'. לפיכך האדריכלית אינה אחראית לביקורת של רשות הרישוי על הביצוע.</w:t>
+        <w:t xml:space="preserve">השירות אינו כולל פיקוח על ביצוע הבנייה עצמה או על טיבה, ולא על לוחות זמנים / ביטוחים / תמחור או כל הקשור לביצוע. לכן האדריכל אינו אחראי לביקורת כלפי רשות הרישוי.</w:t>
       </w:r>
     </w:p>
     <w:p>
@@ -471,193 +656,22 @@
           <w:szCs w:val="26"/>
           <w:rtl/>
         </w:rPr>
-        <w:t xml:space="preserve">4. הגבלת אחריות</w:t>
-      </w:r>
-    </w:p>
-    <w:p>
-      <w:pPr>
-        <w:pStyle w:val="ListParagraph"/>
-        <w:numPr>
-          <w:ilvl w:val="0"/>
-          <w:numId w:val="3"/>
-        </w:numPr>
-        <w:bidi/>
-        <w:spacing w:after="80" w:line="290"/>
-      </w:pPr>
-      <w:r>
-        <w:rPr>
-          <w:rFonts w:ascii="Arial" w:cs="Arial" w:eastAsia="Arial" w:hAnsi="Arial"/>
-          <w:b/>
-          <w:bCs/>
-          <w:sz w:val="22"/>
-          <w:szCs w:val="22"/>
-          <w:rtl/>
-        </w:rPr>
-        <w:t xml:space="preserve">חריגות בנייה קיימות:</w:t>
-      </w:r>
-      <w:r>
-        <w:rPr>
-          <w:rFonts w:ascii="Arial" w:cs="Arial" w:eastAsia="Arial" w:hAnsi="Arial"/>
-          <w:sz w:val="22"/>
-          <w:szCs w:val="22"/>
-          <w:rtl/>
-        </w:rPr>
-        <w:t xml:space="preserve"> ההיתר אינו כולל בדיקה, תכנון או טיפול בחריגות בנייה קיימות, חיזוק מבנים, שיפוץ מערכות, התאמת שטחים או כל עבודה אחרת, ואינו כולל הסדרה של חריגות מההיתר הקיים בשטחים המשותפים או הפרטיים של הבניין, או שינוי בעיצוב החזיתות או בכל אלמנט אחר בחזיתות המבנה ביחס להיתר הבנייה הקיים. היה ותימצא חריגה ע"י פיקוח הבנייה במהלך התהליך – לא תהיה למזמין או למי מהדיירים טענה כלשהי, והאחריות תחול על מזמין העבודה בלבד.</w:t>
-      </w:r>
-    </w:p>
-    <w:p>
-      <w:pPr>
-        <w:pStyle w:val="ListParagraph"/>
-        <w:numPr>
-          <w:ilvl w:val="0"/>
-          <w:numId w:val="3"/>
-        </w:numPr>
-        <w:bidi/>
-        <w:spacing w:after="80" w:line="290"/>
-      </w:pPr>
-      <w:r>
-        <w:rPr>
-          <w:rFonts w:ascii="Arial" w:cs="Arial" w:eastAsia="Arial" w:hAnsi="Arial"/>
-          <w:b/>
-          <w:bCs/>
-          <w:sz w:val="22"/>
-          <w:szCs w:val="22"/>
-          <w:rtl/>
-        </w:rPr>
-        <w:t xml:space="preserve">התאמה להיתר הקיים:</w:t>
-      </w:r>
-      <w:r>
-        <w:rPr>
-          <w:rFonts w:ascii="Arial" w:cs="Arial" w:eastAsia="Arial" w:hAnsi="Arial"/>
-          <w:sz w:val="22"/>
-          <w:szCs w:val="22"/>
-          <w:rtl/>
-        </w:rPr>
-        <w:t xml:space="preserve"> תבוצע התאמה מלאה של המבנה ושל כל אלמנט אחר הקיים בשטח לתוכנית ההיתר, ללא חריגות או שינויים, כדי שעורכת הבקשה תוכל להצהיר כי קיימת התאמה להיתר הקיים.</w:t>
-      </w:r>
-    </w:p>
-    <w:p>
-      <w:pPr>
-        <w:pStyle w:val="ListParagraph"/>
-        <w:numPr>
-          <w:ilvl w:val="0"/>
-          <w:numId w:val="3"/>
-        </w:numPr>
-        <w:bidi/>
-        <w:spacing w:after="80" w:line="290"/>
-      </w:pPr>
-      <w:r>
-        <w:rPr>
-          <w:rFonts w:ascii="Arial" w:cs="Arial" w:eastAsia="Arial" w:hAnsi="Arial"/>
-          <w:b/>
-          <w:bCs/>
-          <w:sz w:val="22"/>
-          <w:szCs w:val="22"/>
-          <w:rtl/>
-        </w:rPr>
-        <w:t xml:space="preserve">אי-התאמה של החזיתות:</w:t>
-      </w:r>
-      <w:r>
-        <w:rPr>
-          <w:rFonts w:ascii="Arial" w:cs="Arial" w:eastAsia="Arial" w:hAnsi="Arial"/>
-          <w:sz w:val="22"/>
-          <w:szCs w:val="22"/>
-          <w:rtl/>
-        </w:rPr>
-        <w:t xml:space="preserve"> במידה ותימצא אי-התאמה של חזיתות המבנה להיתר, מוסכם כי האדריכלית רשאית להסיר את עצמה מתפקיד עורכת הבקשה, ולא תהיה כלפיה כל טענה או אחריות להסדרת חריגות אלה.</w:t>
-      </w:r>
-    </w:p>
-    <w:p>
-      <w:pPr>
-        <w:pStyle w:val="ListParagraph"/>
-        <w:numPr>
-          <w:ilvl w:val="0"/>
-          <w:numId w:val="3"/>
-        </w:numPr>
-        <w:bidi/>
-        <w:spacing w:after="80" w:line="290"/>
-      </w:pPr>
-      <w:r>
-        <w:rPr>
-          <w:rFonts w:ascii="Arial" w:cs="Arial" w:eastAsia="Arial" w:hAnsi="Arial"/>
-          <w:b/>
-          <w:bCs/>
-          <w:sz w:val="22"/>
-          <w:szCs w:val="22"/>
-          <w:rtl/>
-        </w:rPr>
-        <w:t xml:space="preserve">דרישות שאינן קשורות לפרגולה:</w:t>
-      </w:r>
-      <w:r>
-        <w:rPr>
-          <w:rFonts w:ascii="Arial" w:cs="Arial" w:eastAsia="Arial" w:hAnsi="Arial"/>
-          <w:sz w:val="22"/>
-          <w:szCs w:val="22"/>
-          <w:rtl/>
-        </w:rPr>
-        <w:t xml:space="preserve"> אם במהלך התהליך יעלו דרישות מהרשות המקומית שאינן קשורות לתוספת הפרגולה (כגון דרישות בטיחות, תקנות עירוניות חדשות, או דרישה לפירוק אלמנטים שאינם קיימים בהיתר המקורי) – יוגדר שירות נוסף שיתומחר בנפרד, וכל תוספת תתואם ותאושר בכתב לפני ביצועה. פירוק אלמנטים שאינם קיימים בהיתר המקורי, ולוחות הזמנים לטיפול ולביצוע, הם באחריות המבקש בלבד. עיכוב בטיפול בבקשה כתוצאה מסעיפים אלה אינו באחריות האדריכלית.</w:t>
-      </w:r>
-    </w:p>
-    <w:p>
-      <w:pPr>
-        <w:pStyle w:val="ListParagraph"/>
-        <w:numPr>
-          <w:ilvl w:val="0"/>
-          <w:numId w:val="3"/>
-        </w:numPr>
-        <w:bidi/>
-        <w:spacing w:after="80" w:line="290"/>
-      </w:pPr>
-      <w:r>
-        <w:rPr>
-          <w:rFonts w:ascii="Arial" w:cs="Arial" w:eastAsia="Arial" w:hAnsi="Arial"/>
-          <w:b/>
-          <w:bCs/>
-          <w:sz w:val="22"/>
-          <w:szCs w:val="22"/>
-          <w:rtl/>
-        </w:rPr>
-        <w:t xml:space="preserve">ביצוע לאחר ההיתר:</w:t>
-      </w:r>
-      <w:r>
-        <w:rPr>
-          <w:rFonts w:ascii="Arial" w:cs="Arial" w:eastAsia="Arial" w:hAnsi="Arial"/>
-          <w:sz w:val="22"/>
-          <w:szCs w:val="22"/>
-          <w:rtl/>
-        </w:rPr>
-        <w:t xml:space="preserve"> האחריות אינה כוללת כשל בעבודות הנדרשות לאחר קבלת ההיתר (כגון ביצוע הבנייה ע"י קבלנים).</w:t>
-      </w:r>
-    </w:p>
-    <w:p>
-      <w:pPr>
-        <w:pStyle w:val="ListParagraph"/>
-        <w:numPr>
-          <w:ilvl w:val="0"/>
-          <w:numId w:val="3"/>
-        </w:numPr>
-        <w:bidi/>
-        <w:spacing w:after="80" w:line="290"/>
-      </w:pPr>
-      <w:r>
-        <w:rPr>
-          <w:rFonts w:ascii="Arial" w:cs="Arial" w:eastAsia="Arial" w:hAnsi="Arial"/>
-          <w:b/>
-          <w:bCs/>
-          <w:sz w:val="22"/>
-          <w:szCs w:val="22"/>
-          <w:rtl/>
-        </w:rPr>
-        <w:t xml:space="preserve">התנגדויות:</w:t>
-      </w:r>
-      <w:r>
-        <w:rPr>
-          <w:rFonts w:ascii="Arial" w:cs="Arial" w:eastAsia="Arial" w:hAnsi="Arial"/>
-          <w:sz w:val="22"/>
-          <w:szCs w:val="22"/>
-          <w:rtl/>
-        </w:rPr>
-        <w:t xml:space="preserve"> תהליך קבלת ההיתר עשוי לכלול תקופה שבה ניתן להגיש התנגדויות מצד שכנים או גורמים ציבוריים. הטיפול בהתנגדות, אם תוגש, אינו באחריות האדריכלית.</w:t>
+        <w:t xml:space="preserve">7. סיום התקשרות</w:t>
+      </w:r>
+    </w:p>
+    <w:p>
+      <w:pPr>
+        <w:bidi/>
+        <w:spacing w:after="100" w:line="300"/>
+      </w:pPr>
+      <w:r>
+        <w:rPr>
+          <w:rFonts w:ascii="Arial" w:cs="Arial" w:eastAsia="Arial" w:hAnsi="Arial"/>
+          <w:sz w:val="22"/>
+          <w:szCs w:val="22"/>
+          <w:rtl/>
+        </w:rPr>
+        <w:t xml:space="preserve">כל צד יוכל לסיים הסכם זה בכל עת שייבחר עד לשלב התכנון הסופי, ובלבד שנתן הודעה בכתב של 14 יום מראש, ובלבד ששכר המתכנן שולם לו במלואו עד לאותו שלב, לרבות השלב/ים הנמצא/ים בתהליך ההכנה אצל המתכנן, על פי השלמת שלבי העבודה המתוארים בסעיפים דלעיל.</w:t>
       </w:r>
     </w:p>
     <w:p>
@@ -679,19 +693,23 @@
           <w:szCs w:val="26"/>
           <w:rtl/>
         </w:rPr>
-        <w:t xml:space="preserve">5. תנאים כלליים</w:t>
-      </w:r>
-    </w:p>
-    <w:p>
-      <w:pPr>
-        <w:pStyle w:val="ListParagraph"/>
-        <w:numPr>
-          <w:ilvl w:val="0"/>
-          <w:numId w:val="4"/>
-        </w:numPr>
-        <w:bidi/>
-        <w:spacing w:after="80" w:line="290"/>
-      </w:pPr>
+        <w:t xml:space="preserve">8. שכר טרחה ותנאי תשלום</w:t>
+      </w:r>
+    </w:p>
+    <w:p>
+      <w:pPr>
+        <w:bidi/>
+        <w:spacing w:after="100" w:line="300"/>
+      </w:pPr>
+      <w:r>
+        <w:rPr>
+          <w:rFonts w:ascii="Arial" w:cs="Arial" w:eastAsia="Arial" w:hAnsi="Arial"/>
+          <w:sz w:val="22"/>
+          <w:szCs w:val="22"/>
+          <w:rtl/>
+        </w:rPr>
+        <w:t xml:space="preserve">שכר הטרחה עבור הסעיפים לעיל: </w:t>
+      </w:r>
       <w:r>
         <w:rPr>
           <w:rFonts w:ascii="Arial" w:cs="Arial" w:eastAsia="Arial" w:hAnsi="Arial"/>
@@ -701,156 +719,6 @@
           <w:szCs w:val="22"/>
           <w:rtl/>
         </w:rPr>
-        <w:t xml:space="preserve">קניין רוחני:</w:t>
-      </w:r>
-      <w:r>
-        <w:rPr>
-          <w:rFonts w:ascii="Arial" w:cs="Arial" w:eastAsia="Arial" w:hAnsi="Arial"/>
-          <w:sz w:val="22"/>
-          <w:szCs w:val="22"/>
-          <w:rtl/>
-        </w:rPr>
-        <w:t xml:space="preserve"> כל התוכניות והמסמכים שיופקו ע"י האדריכלית הם רכושה המקצועי עד לתשלום מלא.</w:t>
-      </w:r>
-    </w:p>
-    <w:p>
-      <w:pPr>
-        <w:pStyle w:val="ListParagraph"/>
-        <w:numPr>
-          <w:ilvl w:val="0"/>
-          <w:numId w:val="4"/>
-        </w:numPr>
-        <w:bidi/>
-        <w:spacing w:after="80" w:line="290"/>
-      </w:pPr>
-      <w:r>
-        <w:rPr>
-          <w:rFonts w:ascii="Arial" w:cs="Arial" w:eastAsia="Arial" w:hAnsi="Arial"/>
-          <w:b/>
-          <w:bCs/>
-          <w:sz w:val="22"/>
-          <w:szCs w:val="22"/>
-          <w:rtl/>
-        </w:rPr>
-        <w:t xml:space="preserve">סיום התקשרות:</w:t>
-      </w:r>
-      <w:r>
-        <w:rPr>
-          <w:rFonts w:ascii="Arial" w:cs="Arial" w:eastAsia="Arial" w:hAnsi="Arial"/>
-          <w:sz w:val="22"/>
-          <w:szCs w:val="22"/>
-          <w:rtl/>
-        </w:rPr>
-        <w:t xml:space="preserve"> כל צד רשאי לסיים הסכם זה בכל עת עד לשלב התכנון הסופי, בהודעה בכתב של 14 יום מראש, ובלבד ששכר המתכננת שולם במלואו עד לאותו שלב, לרבות השלב/ים הנמצא/ים בתהליך ההכנה, על פי שלבי העבודה המתוארים לעיל.</w:t>
-      </w:r>
-    </w:p>
-    <w:p>
-      <w:pPr>
-        <w:pStyle w:val="ListParagraph"/>
-        <w:numPr>
-          <w:ilvl w:val="0"/>
-          <w:numId w:val="4"/>
-        </w:numPr>
-        <w:bidi/>
-        <w:spacing w:after="80" w:line="290"/>
-      </w:pPr>
-      <w:r>
-        <w:rPr>
-          <w:rFonts w:ascii="Arial" w:cs="Arial" w:eastAsia="Arial" w:hAnsi="Arial"/>
-          <w:b/>
-          <w:bCs/>
-          <w:sz w:val="22"/>
-          <w:szCs w:val="22"/>
-          <w:rtl/>
-        </w:rPr>
-        <w:t xml:space="preserve">תחילת העבודה:</w:t>
-      </w:r>
-      <w:r>
-        <w:rPr>
-          <w:rFonts w:ascii="Arial" w:cs="Arial" w:eastAsia="Arial" w:hAnsi="Arial"/>
-          <w:sz w:val="22"/>
-          <w:szCs w:val="22"/>
-          <w:rtl/>
-        </w:rPr>
-        <w:t xml:space="preserve"> עבודת האדריכלית תחל לאחר קבלת המקדמה הראשונית (התשלום הראשון בטבלה בפרק 6).</w:t>
-      </w:r>
-    </w:p>
-    <w:p>
-      <w:pPr>
-        <w:pStyle w:val="ListParagraph"/>
-        <w:numPr>
-          <w:ilvl w:val="0"/>
-          <w:numId w:val="4"/>
-        </w:numPr>
-        <w:bidi/>
-        <w:spacing w:after="80" w:line="290"/>
-      </w:pPr>
-      <w:r>
-        <w:rPr>
-          <w:rFonts w:ascii="Arial" w:cs="Arial" w:eastAsia="Arial" w:hAnsi="Arial"/>
-          <w:b/>
-          <w:bCs/>
-          <w:sz w:val="22"/>
-          <w:szCs w:val="22"/>
-          <w:rtl/>
-        </w:rPr>
-        <w:t xml:space="preserve">תוקף ההצעה:</w:t>
-      </w:r>
-      <w:r>
-        <w:rPr>
-          <w:rFonts w:ascii="Arial" w:cs="Arial" w:eastAsia="Arial" w:hAnsi="Arial"/>
-          <w:sz w:val="22"/>
-          <w:szCs w:val="22"/>
-          <w:rtl/>
-        </w:rPr>
-        <w:t xml:space="preserve"> הצעה זו תקפה 30 יום ממועד שליחתה.</w:t>
-      </w:r>
-    </w:p>
-    <w:p>
-      <w:pPr>
-        <w:keepNext/>
-        <w:pBdr>
-          <w:bottom w:val="single" w:color="C9C2BC" w:sz="6" w:space="4"/>
-        </w:pBdr>
-        <w:bidi/>
-        <w:spacing w:after="140" w:before="360"/>
-      </w:pPr>
-      <w:r>
-        <w:rPr>
-          <w:rFonts w:ascii="Arial" w:cs="Arial" w:eastAsia="Arial" w:hAnsi="Arial"/>
-          <w:b/>
-          <w:bCs/>
-          <w:color w:val="6E625A"/>
-          <w:sz w:val="26"/>
-          <w:szCs w:val="26"/>
-          <w:rtl/>
-        </w:rPr>
-        <w:t xml:space="preserve">6. שכר טרחה ותנאי תשלום</w:t>
-      </w:r>
-    </w:p>
-    <w:p>
-      <w:pPr>
-        <w:bidi/>
-        <w:spacing w:after="100" w:line="300"/>
-      </w:pPr>
-      <w:r>
-        <w:rPr>
-          <w:rFonts w:ascii="Arial" w:cs="Arial" w:eastAsia="Arial" w:hAnsi="Arial"/>
-          <w:sz w:val="22"/>
-          <w:szCs w:val="22"/>
-          <w:rtl/>
-        </w:rPr>
-        <w:t xml:space="preserve">שכר הטרחה עבור השירותים המפורטים לעיל: </w:t>
-      </w:r>
-      <w:r>
-        <w:rPr>
-          <w:rFonts w:ascii="Arial" w:cs="Arial" w:eastAsia="Arial" w:hAnsi="Arial"/>
-          <w:b/>
-          <w:bCs/>
-          <w:sz w:val="22"/>
-          <w:szCs w:val="22"/>
-          <w:rtl/>
-        </w:rPr>
         <w:t xml:space="preserve">20,000 ₪ + מע"מ</w:t>
       </w:r>
       <w:r>
@@ -861,39 +729,6 @@
           <w:rtl/>
         </w:rPr>
         <w:t xml:space="preserve">.</w:t>
-      </w:r>
-    </w:p>
-    <w:p>
-      <w:pPr>
-        <w:bidi/>
-        <w:spacing w:after="100" w:line="300"/>
-      </w:pPr>
-      <w:r>
-        <w:rPr>
-          <w:rFonts w:ascii="Arial" w:cs="Arial" w:eastAsia="Arial" w:hAnsi="Arial"/>
-          <w:sz w:val="22"/>
-          <w:szCs w:val="22"/>
-          <w:rtl/>
-        </w:rPr>
-        <w:t xml:space="preserve">תעריף שעתי לעבודה מעבר למפורט: 380 ₪ + מע"מ לשעה.</w:t>
-      </w:r>
-    </w:p>
-    <w:p>
-      <w:pPr>
-        <w:keepNext/>
-        <w:bidi/>
-        <w:spacing w:after="80" w:before="220"/>
-      </w:pPr>
-      <w:r>
-        <w:rPr>
-          <w:rFonts w:ascii="Arial" w:cs="Arial" w:eastAsia="Arial" w:hAnsi="Arial"/>
-          <w:b/>
-          <w:bCs/>
-          <w:sz w:val="23"/>
-          <w:szCs w:val="23"/>
-          <w:rtl/>
-        </w:rPr>
-        <w:t xml:space="preserve">תוספת אפשרית – מחשוב ההיתר הקיים</w:t>
       </w:r>
     </w:p>
     <w:p>
@@ -913,7 +748,27 @@
           <w:szCs w:val="22"/>
           <w:rtl/>
         </w:rPr>
-        <w:t xml:space="preserve">הבקשה להיתר מסתמכת על ההיתר הקיים בארכיון העירייה. במידה ויידרש למחשב את ההיתר הקיים, תתווסף תוספת תשלום של עד 9,000 ₪, או תשלום לפי תעריף שעתי – הזול מביניהם.</w:t>
+        <w:t xml:space="preserve">הבקשה להיתר מסתמכת על ההיתר הקיים בארכיון העירייה. במידה ויידרש למחשב את ההיתר הקיים, תהיה תוספת תשלום של עד 9,000 ₪ / תשלום שעתי – לפי הזול מביניהם.</w:t>
+      </w:r>
+    </w:p>
+    <w:p>
+      <w:pPr>
+        <w:pStyle w:val="ListParagraph"/>
+        <w:numPr>
+          <w:ilvl w:val="0"/>
+          <w:numId w:val="2"/>
+        </w:numPr>
+        <w:bidi/>
+        <w:spacing w:after="60" w:line="290"/>
+      </w:pPr>
+      <w:r>
+        <w:rPr>
+          <w:rFonts w:ascii="Arial" w:cs="Arial" w:eastAsia="Arial" w:hAnsi="Arial"/>
+          <w:sz w:val="22"/>
+          <w:szCs w:val="22"/>
+          <w:rtl/>
+        </w:rPr>
+        <w:t xml:space="preserve">תשלום שעתי: 380 ₪ + מע"מ.</w:t>
       </w:r>
     </w:p>
     <w:p>
@@ -1029,7 +884,7 @@
                 <w:szCs w:val="21"/>
                 <w:rtl/>
               </w:rPr>
-              <w:t xml:space="preserve">אבן דרך לתשלום</w:t>
+              <w:t xml:space="preserve">שלב</w:t>
             </w:r>
           </w:p>
         </w:tc>
@@ -1103,7 +958,7 @@
                 <w:szCs w:val="21"/>
                 <w:rtl/>
               </w:rPr>
-              <w:t xml:space="preserve">סכום (₪, לפני מע"מ)</w:t>
+              <w:t xml:space="preserve">סכום (₪)</w:t>
             </w:r>
           </w:p>
         </w:tc>
@@ -1333,7 +1188,7 @@
                 <w:szCs w:val="21"/>
                 <w:rtl/>
               </w:rPr>
-              <w:t xml:space="preserve">בקבלת המידע להיתר</w:t>
+              <w:t xml:space="preserve">בקבלת מידע להיתר</w:t>
             </w:r>
           </w:p>
         </w:tc>
@@ -1635,7 +1490,7 @@
                 <w:szCs w:val="21"/>
                 <w:rtl/>
               </w:rPr>
-              <w:t xml:space="preserve">בסיום דרישות אישור התנאים המקדימים להיתר (הבקשה ממתינה לדיון בוועדה)</w:t>
+              <w:t xml:space="preserve">בסיום דרישות אישור תנאים מקדימים להיתר (בשלב זה הבקשה ממתינה לדיון בוועדה)</w:t>
             </w:r>
           </w:p>
         </w:tc>
@@ -1786,7 +1641,7 @@
                 <w:szCs w:val="21"/>
                 <w:rtl/>
               </w:rPr>
-              <w:t xml:space="preserve">בקבלת החלטת הוועדה</w:t>
+              <w:t xml:space="preserve">בקבלת החלטת ועדה</w:t>
             </w:r>
           </w:p>
         </w:tc>
@@ -1937,7 +1792,7 @@
                 <w:szCs w:val="21"/>
                 <w:rtl/>
               </w:rPr>
-              <w:t xml:space="preserve">בהשלמת דרישות בקרת התכן וקבלת האגרות להיתר</w:t>
+              <w:t xml:space="preserve">בהשלמת דרישות בקרת תכן וקבלת אגרות להיתר</w:t>
             </w:r>
           </w:p>
         </w:tc>
@@ -2153,27 +2008,12 @@
                 <w:szCs w:val="21"/>
                 <w:rtl/>
               </w:rPr>
-              <w:t xml:space="preserve">20,000 ₪</w:t>
+              <w:t xml:space="preserve">20,000 ₪ + מע"מ</w:t>
             </w:r>
           </w:p>
         </w:tc>
       </w:tr>
     </w:tbl>
-    <w:p>
-      <w:pPr>
-        <w:bidi/>
-        <w:spacing w:after="100" w:before="160"/>
-      </w:pPr>
-      <w:r>
-        <w:rPr>
-          <w:rFonts w:ascii="Arial" w:cs="Arial" w:eastAsia="Arial" w:hAnsi="Arial"/>
-          <w:sz w:val="22"/>
-          <w:szCs w:val="22"/>
-          <w:rtl/>
-        </w:rPr>
-        <w:t xml:space="preserve">התשלום יבוצע ע"י המזמין תוך 3 ימי עסקים ממועד דרישת התשלום.</w:t>
-      </w:r>
-    </w:p>
     <w:p>
       <w:pPr>
         <w:bidi/>
@@ -2189,7 +2029,52 @@
           <w:szCs w:val="20"/>
           <w:rtl/>
         </w:rPr>
-        <w:t xml:space="preserve">* גמר התשלום לא יידחה באם המזמין החליט שלא למלא אחר דרישות הוועדה (תשלום אגרה / היטל כלשהו), או באם המזמין לא ידרוש בפועל את היתר הבנייה מרשות הרישוי וכו'.</w:t>
+        <w:t xml:space="preserve">* גמר תשלום לא יידחה באם המזמין החליט לא למלא אחר הדרישות של הוועדה – לשלם אגרה / היטל כלשהו, או באם המזמין לא ידרוש את היתר הבנייה בפועל מרשות הרישוי וכו'.</w:t>
+      </w:r>
+    </w:p>
+    <w:p>
+      <w:pPr>
+        <w:bidi/>
+        <w:spacing w:after="100" w:before="160"/>
+      </w:pPr>
+      <w:r>
+        <w:rPr>
+          <w:rFonts w:ascii="Arial" w:cs="Arial" w:eastAsia="Arial" w:hAnsi="Arial"/>
+          <w:sz w:val="22"/>
+          <w:szCs w:val="22"/>
+          <w:rtl/>
+        </w:rPr>
+        <w:t xml:space="preserve">התשלום יבוצע ע"י המזמין תוך 3 ימי עסקים ממועד דרישת התשלום.</w:t>
+      </w:r>
+    </w:p>
+    <w:p>
+      <w:pPr>
+        <w:bidi/>
+        <w:spacing w:after="100" w:line="300"/>
+      </w:pPr>
+      <w:r>
+        <w:rPr>
+          <w:rFonts w:ascii="Arial" w:cs="Arial" w:eastAsia="Arial" w:hAnsi="Arial"/>
+          <w:sz w:val="22"/>
+          <w:szCs w:val="22"/>
+          <w:rtl/>
+        </w:rPr>
+        <w:t xml:space="preserve">הצעה זו תקפה 30 ימים ממועד שליחתה.</w:t>
+      </w:r>
+    </w:p>
+    <w:p>
+      <w:pPr>
+        <w:bidi/>
+        <w:spacing w:after="100" w:line="300"/>
+      </w:pPr>
+      <w:r>
+        <w:rPr>
+          <w:rFonts w:ascii="Arial" w:cs="Arial" w:eastAsia="Arial" w:hAnsi="Arial"/>
+          <w:sz w:val="22"/>
+          <w:szCs w:val="22"/>
+          <w:rtl/>
+        </w:rPr>
+        <w:t xml:space="preserve">עבודת האדריכל תחל לאחר קבלת מקדמה ראשונית, כמפורט בשלבי התשלום.</w:t>
       </w:r>
     </w:p>
     <w:p>
@@ -2207,7 +2092,7 @@
           <w:szCs w:val="22"/>
           <w:rtl/>
         </w:rPr>
-        <w:t xml:space="preserve">ובזאת באו הצדדים על החתום:</w:t>
+        <w:t xml:space="preserve">9. חתימות</w:t>
       </w:r>
     </w:p>
     <w:tbl>
@@ -2224,9 +2109,10 @@
         </w:tblBorders>
       </w:tblPr>
       <w:tblGrid>
-        <w:gridCol w:w="3212"/>
-        <w:gridCol w:w="3213"/>
-        <w:gridCol w:w="3213"/>
+        <w:gridCol w:w="2409"/>
+        <w:gridCol w:w="2409"/>
+        <w:gridCol w:w="2409"/>
+        <w:gridCol w:w="2409"/>
       </w:tblGrid>
       <w:tr>
         <w:trPr>
@@ -2234,7 +2120,7 @@
         </w:trPr>
         <w:tc>
           <w:tcPr>
-            <w:tcW w:type="dxa" w:w="3212"/>
+            <w:tcW w:type="dxa" w:w="2409"/>
             <w:tcBorders>
               <w:top w:val="none" w:color="FFFFFF" w:sz="0"/>
               <w:left w:val="none" w:color="FFFFFF" w:sz="0"/>
@@ -2256,7 +2142,7 @@
                 <w:szCs w:val="22"/>
                 <w:rtl/>
               </w:rPr>
-              <w:t xml:space="preserve">_____________________</w:t>
+              <w:t xml:space="preserve">______________</w:t>
             </w:r>
           </w:p>
           <w:p>
@@ -2272,13 +2158,13 @@
                 <w:szCs w:val="20"/>
                 <w:rtl/>
               </w:rPr>
-              <w:t xml:space="preserve">חתימת המזמין/ים</w:t>
-            </w:r>
-          </w:p>
-        </w:tc>
-        <w:tc>
-          <w:tcPr>
-            <w:tcW w:type="dxa" w:w="3212"/>
+              <w:t xml:space="preserve">המזמין</w:t>
+            </w:r>
+          </w:p>
+        </w:tc>
+        <w:tc>
+          <w:tcPr>
+            <w:tcW w:type="dxa" w:w="2409"/>
             <w:tcBorders>
               <w:top w:val="none" w:color="FFFFFF" w:sz="0"/>
               <w:left w:val="none" w:color="FFFFFF" w:sz="0"/>
@@ -2300,7 +2186,7 @@
                 <w:szCs w:val="22"/>
                 <w:rtl/>
               </w:rPr>
-              <w:t xml:space="preserve">_____________________</w:t>
+              <w:t xml:space="preserve">______________</w:t>
             </w:r>
           </w:p>
           <w:p>
@@ -2322,7 +2208,7 @@
         </w:tc>
         <w:tc>
           <w:tcPr>
-            <w:tcW w:type="dxa" w:w="3212"/>
+            <w:tcW w:type="dxa" w:w="2409"/>
             <w:tcBorders>
               <w:top w:val="none" w:color="FFFFFF" w:sz="0"/>
               <w:left w:val="none" w:color="FFFFFF" w:sz="0"/>
@@ -2344,7 +2230,7 @@
                 <w:szCs w:val="22"/>
                 <w:rtl/>
               </w:rPr>
-              <w:t xml:space="preserve">_____________________</w:t>
+              <w:t xml:space="preserve">______________</w:t>
             </w:r>
           </w:p>
           <w:p>
@@ -2360,7 +2246,51 @@
                 <w:szCs w:val="20"/>
                 <w:rtl/>
               </w:rPr>
-              <w:t xml:space="preserve">חתימת המתכננת</w:t>
+              <w:t xml:space="preserve">האדריכל / נותן השירות</w:t>
+            </w:r>
+          </w:p>
+        </w:tc>
+        <w:tc>
+          <w:tcPr>
+            <w:tcW w:type="dxa" w:w="2409"/>
+            <w:tcBorders>
+              <w:top w:val="none" w:color="FFFFFF" w:sz="0"/>
+              <w:left w:val="none" w:color="FFFFFF" w:sz="0"/>
+              <w:bottom w:val="none" w:color="FFFFFF" w:sz="0"/>
+              <w:right w:val="none" w:color="FFFFFF" w:sz="0"/>
+            </w:tcBorders>
+          </w:tcPr>
+          <w:p>
+            <w:pPr>
+              <w:bidi/>
+              <w:spacing w:after="40" w:before="440"/>
+              <w:jc w:val="center"/>
+            </w:pPr>
+            <w:r>
+              <w:rPr>
+                <w:rFonts w:ascii="Arial" w:cs="Arial" w:eastAsia="Arial" w:hAnsi="Arial"/>
+                <w:color w:val="8C8C8C"/>
+                <w:sz w:val="22"/>
+                <w:szCs w:val="22"/>
+                <w:rtl/>
+              </w:rPr>
+              <w:t xml:space="preserve">______________</w:t>
+            </w:r>
+          </w:p>
+          <w:p>
+            <w:pPr>
+              <w:bidi/>
+              <w:spacing w:after="100" w:line="300"/>
+              <w:jc w:val="center"/>
+            </w:pPr>
+            <w:r>
+              <w:rPr>
+                <w:rFonts w:ascii="Arial" w:cs="Arial" w:eastAsia="Arial" w:hAnsi="Arial"/>
+                <w:sz w:val="20"/>
+                <w:szCs w:val="20"/>
+                <w:rtl/>
+              </w:rPr>
+              <w:t xml:space="preserve">תאריך</w:t>
             </w:r>
           </w:p>
         </w:tc>
@@ -2835,12 +2765,6 @@
     </w:lvlOverride>
   </w:num>
   <w:num w:numId="3">
-    <w:abstractNumId w:val="3"/>
-    <w:lvlOverride w:ilvl="0">
-      <w:startOverride w:val="1"/>
-    </w:lvlOverride>
-  </w:num>
-  <w:num w:numId="4">
     <w:abstractNumId w:val="3"/>
     <w:lvlOverride w:ilvl="0">
       <w:startOverride w:val="1"/>

</xml_diff>